<commit_message>
update sample generation scripts
</commit_message>
<xml_diff>
--- a/docs/version_history.docx
+++ b/docs/version_history.docx
@@ -341,21 +341,37 @@
         <w:t xml:space="preserve"> </w:t>
       </w:r>
       <w:r>
-        <w:t xml:space="preserve">With a sufficiently large </w:t>
-      </w:r>
-      <m:oMath>
-        <m:r>
-          <w:rPr>
-            <w:rFonts w:ascii="Cambria Math" w:hAnsi="Cambria Math"/>
-          </w:rPr>
-          <m:t>m</m:t>
-        </m:r>
-      </m:oMath>
+        <w:t>W</w:t>
+      </w:r>
       <w:r>
         <w:rPr>
           <w:rFonts w:eastAsiaTheme="minorEastAsia"/>
         </w:rPr>
-        <w:t xml:space="preserve">, we can determine the proportion </w:t>
+        <w:t xml:space="preserve">e </w:t>
+      </w:r>
+      <w:r>
+        <w:rPr>
+          <w:rFonts w:eastAsiaTheme="minorEastAsia"/>
+        </w:rPr>
+        <w:t>d</w:t>
+      </w:r>
+      <w:r>
+        <w:rPr>
+          <w:rFonts w:eastAsiaTheme="minorEastAsia"/>
+        </w:rPr>
+        <w:t>etermine</w:t>
+      </w:r>
+      <w:r>
+        <w:rPr>
+          <w:rFonts w:eastAsiaTheme="minorEastAsia"/>
+        </w:rPr>
+        <w:t>d</w:t>
+      </w:r>
+      <w:r>
+        <w:rPr>
+          <w:rFonts w:eastAsiaTheme="minorEastAsia"/>
+        </w:rPr>
+        <w:t xml:space="preserve"> the proportion </w:t>
       </w:r>
       <m:oMath>
         <m:r>
@@ -369,10 +385,14 @@
         <w:rPr>
           <w:rFonts w:eastAsiaTheme="minorEastAsia"/>
         </w:rPr>
-        <w:t xml:space="preserve"> of the original points to keep:</w:t>
-      </w:r>
-    </w:p>
-    <w:p>
+        <w:t xml:space="preserve"> of the original points to keep</w:t>
+      </w:r>
+      <w:r>
+        <w:rPr>
+          <w:rFonts w:eastAsiaTheme="minorEastAsia"/>
+        </w:rPr>
+        <w:t xml:space="preserve"> as </w:t>
+      </w:r>
       <w:r>
         <w:rPr>
           <w:rFonts w:eastAsiaTheme="minorEastAsia"/>
@@ -439,10 +459,20 @@
           </m:den>
         </m:f>
       </m:oMath>
-    </w:p>
-    <w:p>
-      <w:r>
-        <w:t>Based on these calculations, we randomly selected points to keep from the original sample and drew additional samples as needed.</w:t>
+      <w:r>
+        <w:rPr>
+          <w:rFonts w:eastAsiaTheme="minorEastAsia"/>
+        </w:rPr>
+        <w:t>,  then b</w:t>
+      </w:r>
+      <w:r>
+        <w:t xml:space="preserve">ased on these calculations, we randomly selected points to keep from the original sample and drew additional samples </w:t>
+      </w:r>
+      <w:r>
+        <w:t>to bring the number of samples up to the original number</w:t>
+      </w:r>
+      <w:r>
+        <w:t>.</w:t>
       </w:r>
       <w:r>
         <w:t xml:space="preserve"> </w:t>
@@ -491,14 +521,29 @@
         <w:t>To address this, w</w:t>
       </w:r>
       <w:r>
-        <w:t xml:space="preserve">e accessed MASIE data for comparison. This data first became available in 2006, so we restricted the samples to 2006 and onward. In addition, we </w:t>
+        <w:t xml:space="preserve">e accessed MASIE data for comparison. This data first became available in 2006, so we restricted the samples to 2006 and onward. The MASIE dataset enabled us to flag where there were large discrepancies between estimated sea ice fraction in the NSIDC dataset and the MASIE ice extent. </w:t>
+      </w:r>
+      <w:r>
+        <w:t>While</w:t>
+      </w:r>
+      <w:r>
+        <w:t xml:space="preserve"> the ice extent in MASIE still </w:t>
       </w:r>
       <w:r>
         <w:lastRenderedPageBreak/>
-        <w:t>allowed the end year for samples to 2023. The MASIE dataset enabled us to flag where there were large discrepancies between estimated sea ice fraction in the NSIDC dataset and the MASIE ice extent. However, the ice extent in MASIE still didn’t match perfectly with visual analysis.</w:t>
-      </w:r>
-      <w:r>
-        <w:t xml:space="preserve"> We drew additional samples to match the shifted time window, and continued working on manual floe labeling.</w:t>
+        <w:t>didn’t match perfectly with visual analysis</w:t>
+      </w:r>
+      <w:r>
+        <w:t>, it did help us identify cases where insufficient sea ice was present.</w:t>
+      </w:r>
+      <w:r>
+        <w:t xml:space="preserve"> We drew additional samples to </w:t>
+      </w:r>
+      <w:r>
+        <w:t xml:space="preserve">replace samples dropped by the </w:t>
+      </w:r>
+      <w:r>
+        <w:t>the shifted time window, and continued working on manual floe labeling.</w:t>
       </w:r>
     </w:p>
     <w:p>
@@ -507,10 +552,10 @@
       </w:pPr>
       <w:r>
         <w:drawing>
-          <wp:inline distT="0" distB="0" distL="0" distR="0" wp14:anchorId="7760E44C" wp14:editId="0949884E">
-            <wp:extent cx="3342105" cy="4453997"/>
-            <wp:effectExtent l="0" t="0" r="0" b="3810"/>
-            <wp:docPr id="644794564" name="Picture 1"/>
+          <wp:inline distT="0" distB="0" distL="0" distR="0" wp14:anchorId="7F1BC1FD" wp14:editId="2412CE9E">
+            <wp:extent cx="4338049" cy="5772942"/>
+            <wp:effectExtent l="0" t="0" r="5715" b="5715"/>
+            <wp:docPr id="37974304" name="Picture 1"/>
             <wp:cNvGraphicFramePr>
               <a:graphicFrameLocks xmlns:a="http://schemas.openxmlformats.org/drawingml/2006/main" noChangeAspect="1"/>
             </wp:cNvGraphicFramePr>
@@ -518,7 +563,7 @@
               <a:graphicData uri="http://schemas.openxmlformats.org/drawingml/2006/picture">
                 <pic:pic xmlns:pic="http://schemas.openxmlformats.org/drawingml/2006/picture">
                   <pic:nvPicPr>
-                    <pic:cNvPr id="644794564" name=""/>
+                    <pic:cNvPr id="37974304" name=""/>
                     <pic:cNvPicPr/>
                   </pic:nvPicPr>
                   <pic:blipFill>
@@ -530,7 +575,7 @@
                   <pic:spPr>
                     <a:xfrm>
                       <a:off x="0" y="0"/>
-                      <a:ext cx="3342105" cy="4453997"/>
+                      <a:ext cx="4360576" cy="5802920"/>
                     </a:xfrm>
                     <a:prstGeom prst="rect">
                       <a:avLst/>
@@ -561,8 +606,10 @@
       <w:r>
         <w:t>: Original (gray) and updated (colors) region boundaries for the random sampling approach. The dash-dotted line shows the Arctic Circle.</w:t>
       </w:r>
+      <w:r>
+        <w:t xml:space="preserve"> Yellow and red points were in the original sample and dropped after the restructuring of the time and space domain.</w:t>
+      </w:r>
     </w:p>
-    <w:p/>
     <w:p>
       <w:pPr>
         <w:pStyle w:val="ListParagraph"/>
@@ -581,15 +628,23 @@
       </w:r>
     </w:p>
     <w:p>
-      <w:r>
-        <w:t xml:space="preserve">During </w:t>
+      <w:pPr>
+        <w:pStyle w:val="Heading2"/>
+      </w:pPr>
+      <w:r>
+        <w:lastRenderedPageBreak/>
+        <w:t>Fall 2026: Overhaul, cleanup, and release of Version 1.0</w:t>
       </w:r>
     </w:p>
-    <w:p/>
     <w:p>
       <w:r>
-        <w:lastRenderedPageBreak/>
-        <w:t xml:space="preserve">During Fall 2026, we performed a major overhaul of the dataset to address the need for a rigorous set of point samples for calibrating the Ice Floe Tracker classifier function. In addition, we found it necessary to expand the sample to include 500 km by 500 km images. These images were drawn as a superset of the 100 km images, starting from identifying the region centered at the original 100 km sample, then adjusting the location to stay within the bounding boxes for the regions as necessary. </w:t>
+        <w:t xml:space="preserve">During Fall 2026, we performed a major overhaul of the dataset to address the need for a rigorous set of point samples for calibrating the Ice Floe Tracker classifier function. In addition, we found it necessary to expand the sample to include 500 km by 500 km images. These images were drawn as a superset of the 100 km images, starting from identifying the region centered at the original 100 km sample, then </w:t>
+      </w:r>
+      <w:r>
+        <w:t>aligning the bounds</w:t>
+      </w:r>
+      <w:r>
+        <w:t xml:space="preserve"> to stay within the bounding boxes for the regions as necessary. </w:t>
       </w:r>
     </w:p>
     <w:p>
@@ -618,6 +673,9 @@
     <w:p>
       <w:r>
         <w:t xml:space="preserve">The MASIE sea ice extent proved not to be as useful as anticipated. </w:t>
+      </w:r>
+      <w:r>
+        <w:t>As a second source of information on sea ice, I’m adding the sea ice concentration from the UBremen ARTIST algorithm.</w:t>
       </w:r>
     </w:p>
     <w:p>
@@ -644,6 +702,8 @@
         <w:t>Addition of ASI images</w:t>
       </w:r>
     </w:p>
+    <w:p/>
+    <w:p/>
     <w:p/>
     <w:p/>
     <w:p>

</xml_diff>

<commit_message>
Updating the documentation and code structure
</commit_message>
<xml_diff>
--- a/docs/version_history.docx
+++ b/docs/version_history.docx
@@ -668,6 +668,860 @@
       </w:r>
       <w:r>
         <w:t>). This date is earlier than the dates for two of the samples: cases 171 and 173.</w:t>
+      </w:r>
+      <w:r>
+        <w:t xml:space="preserve"> We also noticed cases where the 100 km samples were not fully within the region boundaries due to insufficient buffering when drawing center location samples.</w:t>
+      </w:r>
+    </w:p>
+    <w:p>
+      <w:r>
+        <w:t>In total, issues were identified in 9 cases:</w:t>
+      </w:r>
+      <w:r>
+        <w:br/>
+      </w:r>
+    </w:p>
+    <w:tbl>
+      <w:tblPr>
+        <w:tblW w:w="8980" w:type="dxa"/>
+        <w:tblInd w:w="-8" w:type="dxa"/>
+        <w:tblCellMar>
+          <w:top w:w="15" w:type="dxa"/>
+          <w:left w:w="15" w:type="dxa"/>
+          <w:bottom w:w="15" w:type="dxa"/>
+          <w:right w:w="15" w:type="dxa"/>
+        </w:tblCellMar>
+        <w:tblLook w:val="04A0" w:firstRow="1" w:lastRow="0" w:firstColumn="1" w:lastColumn="0" w:noHBand="0" w:noVBand="1"/>
+      </w:tblPr>
+      <w:tblGrid>
+        <w:gridCol w:w="1252"/>
+        <w:gridCol w:w="1440"/>
+        <w:gridCol w:w="2070"/>
+        <w:gridCol w:w="4218"/>
+      </w:tblGrid>
+      <w:tr>
+        <w:tc>
+          <w:tcPr>
+            <w:tcW w:w="1252" w:type="dxa"/>
+            <w:tcBorders>
+              <w:top w:val="single" w:sz="6" w:space="0" w:color="000000"/>
+              <w:left w:val="single" w:sz="6" w:space="0" w:color="000000"/>
+              <w:bottom w:val="single" w:sz="6" w:space="0" w:color="000000"/>
+              <w:right w:val="single" w:sz="6" w:space="0" w:color="000000"/>
+            </w:tcBorders>
+            <w:vAlign w:val="center"/>
+            <w:hideMark/>
+          </w:tcPr>
+          <w:p>
+            <w:r>
+              <w:t>Case Number</w:t>
+            </w:r>
+          </w:p>
+        </w:tc>
+        <w:tc>
+          <w:tcPr>
+            <w:tcW w:w="1440" w:type="dxa"/>
+            <w:tcBorders>
+              <w:top w:val="single" w:sz="6" w:space="0" w:color="000000"/>
+              <w:left w:val="single" w:sz="6" w:space="0" w:color="000000"/>
+              <w:bottom w:val="single" w:sz="6" w:space="0" w:color="000000"/>
+              <w:right w:val="single" w:sz="6" w:space="0" w:color="000000"/>
+            </w:tcBorders>
+            <w:vAlign w:val="center"/>
+            <w:hideMark/>
+          </w:tcPr>
+          <w:p>
+            <w:r>
+              <w:t>Date</w:t>
+            </w:r>
+          </w:p>
+        </w:tc>
+        <w:tc>
+          <w:tcPr>
+            <w:tcW w:w="2070" w:type="dxa"/>
+            <w:tcBorders>
+              <w:top w:val="single" w:sz="6" w:space="0" w:color="000000"/>
+              <w:left w:val="single" w:sz="6" w:space="0" w:color="000000"/>
+              <w:bottom w:val="single" w:sz="6" w:space="0" w:color="000000"/>
+              <w:right w:val="single" w:sz="6" w:space="0" w:color="000000"/>
+            </w:tcBorders>
+            <w:vAlign w:val="center"/>
+            <w:hideMark/>
+          </w:tcPr>
+          <w:p>
+            <w:r>
+              <w:t>Region</w:t>
+            </w:r>
+          </w:p>
+        </w:tc>
+        <w:tc>
+          <w:tcPr>
+            <w:tcW w:w="4218" w:type="dxa"/>
+            <w:tcBorders>
+              <w:top w:val="single" w:sz="6" w:space="0" w:color="000000"/>
+              <w:left w:val="single" w:sz="6" w:space="0" w:color="000000"/>
+              <w:bottom w:val="single" w:sz="6" w:space="0" w:color="000000"/>
+              <w:right w:val="single" w:sz="6" w:space="0" w:color="000000"/>
+            </w:tcBorders>
+            <w:vAlign w:val="center"/>
+            <w:hideMark/>
+          </w:tcPr>
+          <w:p>
+            <w:r>
+              <w:t>Notes</w:t>
+            </w:r>
+          </w:p>
+        </w:tc>
+      </w:tr>
+      <w:tr>
+        <w:tc>
+          <w:tcPr>
+            <w:tcW w:w="1252" w:type="dxa"/>
+            <w:tcBorders>
+              <w:top w:val="single" w:sz="6" w:space="0" w:color="000000"/>
+              <w:left w:val="single" w:sz="6" w:space="0" w:color="000000"/>
+              <w:bottom w:val="single" w:sz="6" w:space="0" w:color="000000"/>
+              <w:right w:val="single" w:sz="6" w:space="0" w:color="000000"/>
+            </w:tcBorders>
+            <w:vAlign w:val="center"/>
+            <w:hideMark/>
+          </w:tcPr>
+          <w:p>
+            <w:r>
+              <w:t>Case 001</w:t>
+            </w:r>
+          </w:p>
+        </w:tc>
+        <w:tc>
+          <w:tcPr>
+            <w:tcW w:w="1440" w:type="dxa"/>
+            <w:tcBorders>
+              <w:top w:val="single" w:sz="6" w:space="0" w:color="000000"/>
+              <w:left w:val="single" w:sz="6" w:space="0" w:color="000000"/>
+              <w:bottom w:val="single" w:sz="6" w:space="0" w:color="000000"/>
+              <w:right w:val="single" w:sz="6" w:space="0" w:color="000000"/>
+            </w:tcBorders>
+            <w:vAlign w:val="center"/>
+            <w:hideMark/>
+          </w:tcPr>
+          <w:p>
+            <w:r>
+              <w:t>2022-09-11</w:t>
+            </w:r>
+          </w:p>
+        </w:tc>
+        <w:tc>
+          <w:tcPr>
+            <w:tcW w:w="2070" w:type="dxa"/>
+            <w:tcBorders>
+              <w:top w:val="single" w:sz="6" w:space="0" w:color="000000"/>
+              <w:left w:val="single" w:sz="6" w:space="0" w:color="000000"/>
+              <w:bottom w:val="single" w:sz="6" w:space="0" w:color="000000"/>
+              <w:right w:val="single" w:sz="6" w:space="0" w:color="000000"/>
+            </w:tcBorders>
+            <w:vAlign w:val="center"/>
+            <w:hideMark/>
+          </w:tcPr>
+          <w:p>
+            <w:r>
+              <w:t>Baffin Bay</w:t>
+            </w:r>
+          </w:p>
+        </w:tc>
+        <w:tc>
+          <w:tcPr>
+            <w:tcW w:w="4218" w:type="dxa"/>
+            <w:tcBorders>
+              <w:top w:val="single" w:sz="6" w:space="0" w:color="000000"/>
+              <w:left w:val="single" w:sz="6" w:space="0" w:color="000000"/>
+              <w:bottom w:val="single" w:sz="6" w:space="0" w:color="000000"/>
+              <w:right w:val="single" w:sz="6" w:space="0" w:color="000000"/>
+            </w:tcBorders>
+            <w:vAlign w:val="center"/>
+            <w:hideMark/>
+          </w:tcPr>
+          <w:p>
+            <w:r>
+              <w:t>Overlaps left bound of region</w:t>
+            </w:r>
+          </w:p>
+        </w:tc>
+      </w:tr>
+      <w:tr>
+        <w:tc>
+          <w:tcPr>
+            <w:tcW w:w="1252" w:type="dxa"/>
+            <w:tcBorders>
+              <w:top w:val="single" w:sz="6" w:space="0" w:color="000000"/>
+              <w:left w:val="single" w:sz="6" w:space="0" w:color="000000"/>
+              <w:bottom w:val="single" w:sz="6" w:space="0" w:color="000000"/>
+              <w:right w:val="single" w:sz="6" w:space="0" w:color="000000"/>
+            </w:tcBorders>
+            <w:vAlign w:val="center"/>
+            <w:hideMark/>
+          </w:tcPr>
+          <w:p>
+            <w:r>
+              <w:t>Case 039</w:t>
+            </w:r>
+          </w:p>
+        </w:tc>
+        <w:tc>
+          <w:tcPr>
+            <w:tcW w:w="1440" w:type="dxa"/>
+            <w:tcBorders>
+              <w:top w:val="single" w:sz="6" w:space="0" w:color="000000"/>
+              <w:left w:val="single" w:sz="6" w:space="0" w:color="000000"/>
+              <w:bottom w:val="single" w:sz="6" w:space="0" w:color="000000"/>
+              <w:right w:val="single" w:sz="6" w:space="0" w:color="000000"/>
+            </w:tcBorders>
+            <w:vAlign w:val="center"/>
+            <w:hideMark/>
+          </w:tcPr>
+          <w:p>
+            <w:r>
+              <w:t>2017-05-26</w:t>
+            </w:r>
+          </w:p>
+        </w:tc>
+        <w:tc>
+          <w:tcPr>
+            <w:tcW w:w="2070" w:type="dxa"/>
+            <w:tcBorders>
+              <w:top w:val="single" w:sz="6" w:space="0" w:color="000000"/>
+              <w:left w:val="single" w:sz="6" w:space="0" w:color="000000"/>
+              <w:bottom w:val="single" w:sz="6" w:space="0" w:color="000000"/>
+              <w:right w:val="single" w:sz="6" w:space="0" w:color="000000"/>
+            </w:tcBorders>
+            <w:vAlign w:val="center"/>
+            <w:hideMark/>
+          </w:tcPr>
+          <w:p>
+            <w:r>
+              <w:t>Barents-Kara Seas</w:t>
+            </w:r>
+          </w:p>
+        </w:tc>
+        <w:tc>
+          <w:tcPr>
+            <w:tcW w:w="4218" w:type="dxa"/>
+            <w:tcBorders>
+              <w:top w:val="single" w:sz="6" w:space="0" w:color="000000"/>
+              <w:left w:val="single" w:sz="6" w:space="0" w:color="000000"/>
+              <w:bottom w:val="single" w:sz="6" w:space="0" w:color="000000"/>
+              <w:right w:val="single" w:sz="6" w:space="0" w:color="000000"/>
+            </w:tcBorders>
+            <w:vAlign w:val="center"/>
+            <w:hideMark/>
+          </w:tcPr>
+          <w:p>
+            <w:r>
+              <w:t>Missing data from MODIS (Blank falsecolor image)</w:t>
+            </w:r>
+          </w:p>
+        </w:tc>
+      </w:tr>
+      <w:tr>
+        <w:tc>
+          <w:tcPr>
+            <w:tcW w:w="1252" w:type="dxa"/>
+            <w:tcBorders>
+              <w:top w:val="single" w:sz="6" w:space="0" w:color="000000"/>
+              <w:left w:val="single" w:sz="6" w:space="0" w:color="000000"/>
+              <w:bottom w:val="single" w:sz="6" w:space="0" w:color="000000"/>
+              <w:right w:val="single" w:sz="6" w:space="0" w:color="000000"/>
+            </w:tcBorders>
+            <w:vAlign w:val="center"/>
+            <w:hideMark/>
+          </w:tcPr>
+          <w:p>
+            <w:r>
+              <w:t>Case 088</w:t>
+            </w:r>
+          </w:p>
+        </w:tc>
+        <w:tc>
+          <w:tcPr>
+            <w:tcW w:w="1440" w:type="dxa"/>
+            <w:tcBorders>
+              <w:top w:val="single" w:sz="6" w:space="0" w:color="000000"/>
+              <w:left w:val="single" w:sz="6" w:space="0" w:color="000000"/>
+              <w:bottom w:val="single" w:sz="6" w:space="0" w:color="000000"/>
+              <w:right w:val="single" w:sz="6" w:space="0" w:color="000000"/>
+            </w:tcBorders>
+            <w:vAlign w:val="center"/>
+            <w:hideMark/>
+          </w:tcPr>
+          <w:p>
+            <w:r>
+              <w:t>2014-08-08</w:t>
+            </w:r>
+          </w:p>
+        </w:tc>
+        <w:tc>
+          <w:tcPr>
+            <w:tcW w:w="2070" w:type="dxa"/>
+            <w:tcBorders>
+              <w:top w:val="single" w:sz="6" w:space="0" w:color="000000"/>
+              <w:left w:val="single" w:sz="6" w:space="0" w:color="000000"/>
+              <w:bottom w:val="single" w:sz="6" w:space="0" w:color="000000"/>
+              <w:right w:val="single" w:sz="6" w:space="0" w:color="000000"/>
+            </w:tcBorders>
+            <w:vAlign w:val="center"/>
+            <w:hideMark/>
+          </w:tcPr>
+          <w:p>
+            <w:r>
+              <w:t>East Siberian Sea</w:t>
+            </w:r>
+          </w:p>
+        </w:tc>
+        <w:tc>
+          <w:tcPr>
+            <w:tcW w:w="4218" w:type="dxa"/>
+            <w:tcBorders>
+              <w:top w:val="single" w:sz="6" w:space="0" w:color="000000"/>
+              <w:left w:val="single" w:sz="6" w:space="0" w:color="000000"/>
+              <w:bottom w:val="single" w:sz="6" w:space="0" w:color="000000"/>
+              <w:right w:val="single" w:sz="6" w:space="0" w:color="000000"/>
+            </w:tcBorders>
+            <w:vAlign w:val="center"/>
+            <w:hideMark/>
+          </w:tcPr>
+          <w:p>
+            <w:r>
+              <w:t>Overlaps left bound of region</w:t>
+            </w:r>
+          </w:p>
+        </w:tc>
+      </w:tr>
+      <w:tr>
+        <w:tc>
+          <w:tcPr>
+            <w:tcW w:w="1252" w:type="dxa"/>
+            <w:tcBorders>
+              <w:top w:val="single" w:sz="6" w:space="0" w:color="000000"/>
+              <w:left w:val="single" w:sz="6" w:space="0" w:color="000000"/>
+              <w:bottom w:val="single" w:sz="6" w:space="0" w:color="000000"/>
+              <w:right w:val="single" w:sz="6" w:space="0" w:color="000000"/>
+            </w:tcBorders>
+            <w:vAlign w:val="center"/>
+            <w:hideMark/>
+          </w:tcPr>
+          <w:p>
+            <w:r>
+              <w:t>Case 126</w:t>
+            </w:r>
+          </w:p>
+        </w:tc>
+        <w:tc>
+          <w:tcPr>
+            <w:tcW w:w="1440" w:type="dxa"/>
+            <w:tcBorders>
+              <w:top w:val="single" w:sz="6" w:space="0" w:color="000000"/>
+              <w:left w:val="single" w:sz="6" w:space="0" w:color="000000"/>
+              <w:bottom w:val="single" w:sz="6" w:space="0" w:color="000000"/>
+              <w:right w:val="single" w:sz="6" w:space="0" w:color="000000"/>
+            </w:tcBorders>
+            <w:vAlign w:val="center"/>
+            <w:hideMark/>
+          </w:tcPr>
+          <w:p>
+            <w:r>
+              <w:t>2009-03-14</w:t>
+            </w:r>
+          </w:p>
+        </w:tc>
+        <w:tc>
+          <w:tcPr>
+            <w:tcW w:w="2070" w:type="dxa"/>
+            <w:tcBorders>
+              <w:top w:val="single" w:sz="6" w:space="0" w:color="000000"/>
+              <w:left w:val="single" w:sz="6" w:space="0" w:color="000000"/>
+              <w:bottom w:val="single" w:sz="6" w:space="0" w:color="000000"/>
+              <w:right w:val="single" w:sz="6" w:space="0" w:color="000000"/>
+            </w:tcBorders>
+            <w:vAlign w:val="center"/>
+            <w:hideMark/>
+          </w:tcPr>
+          <w:p>
+            <w:r>
+              <w:t>Greenland Sea</w:t>
+            </w:r>
+          </w:p>
+        </w:tc>
+        <w:tc>
+          <w:tcPr>
+            <w:tcW w:w="4218" w:type="dxa"/>
+            <w:tcBorders>
+              <w:top w:val="single" w:sz="6" w:space="0" w:color="000000"/>
+              <w:left w:val="single" w:sz="6" w:space="0" w:color="000000"/>
+              <w:bottom w:val="single" w:sz="6" w:space="0" w:color="000000"/>
+              <w:right w:val="single" w:sz="6" w:space="0" w:color="000000"/>
+            </w:tcBorders>
+            <w:vAlign w:val="center"/>
+            <w:hideMark/>
+          </w:tcPr>
+          <w:p>
+            <w:r>
+              <w:t>Overlaps upper bound of region</w:t>
+            </w:r>
+          </w:p>
+        </w:tc>
+      </w:tr>
+      <w:tr>
+        <w:tc>
+          <w:tcPr>
+            <w:tcW w:w="1252" w:type="dxa"/>
+            <w:tcBorders>
+              <w:top w:val="single" w:sz="6" w:space="0" w:color="000000"/>
+              <w:left w:val="single" w:sz="6" w:space="0" w:color="000000"/>
+              <w:bottom w:val="single" w:sz="6" w:space="0" w:color="000000"/>
+              <w:right w:val="single" w:sz="6" w:space="0" w:color="000000"/>
+            </w:tcBorders>
+            <w:vAlign w:val="center"/>
+            <w:hideMark/>
+          </w:tcPr>
+          <w:p>
+            <w:r>
+              <w:t>Case 142</w:t>
+            </w:r>
+          </w:p>
+        </w:tc>
+        <w:tc>
+          <w:tcPr>
+            <w:tcW w:w="1440" w:type="dxa"/>
+            <w:tcBorders>
+              <w:top w:val="single" w:sz="6" w:space="0" w:color="000000"/>
+              <w:left w:val="single" w:sz="6" w:space="0" w:color="000000"/>
+              <w:bottom w:val="single" w:sz="6" w:space="0" w:color="000000"/>
+              <w:right w:val="single" w:sz="6" w:space="0" w:color="000000"/>
+            </w:tcBorders>
+            <w:vAlign w:val="center"/>
+            <w:hideMark/>
+          </w:tcPr>
+          <w:p>
+            <w:r>
+              <w:t>2017-07-16</w:t>
+            </w:r>
+          </w:p>
+        </w:tc>
+        <w:tc>
+          <w:tcPr>
+            <w:tcW w:w="2070" w:type="dxa"/>
+            <w:tcBorders>
+              <w:top w:val="single" w:sz="6" w:space="0" w:color="000000"/>
+              <w:left w:val="single" w:sz="6" w:space="0" w:color="000000"/>
+              <w:bottom w:val="single" w:sz="6" w:space="0" w:color="000000"/>
+              <w:right w:val="single" w:sz="6" w:space="0" w:color="000000"/>
+            </w:tcBorders>
+            <w:vAlign w:val="center"/>
+            <w:hideMark/>
+          </w:tcPr>
+          <w:p>
+            <w:r>
+              <w:t>Hudson Bay</w:t>
+            </w:r>
+          </w:p>
+        </w:tc>
+        <w:tc>
+          <w:tcPr>
+            <w:tcW w:w="4218" w:type="dxa"/>
+            <w:tcBorders>
+              <w:top w:val="single" w:sz="6" w:space="0" w:color="000000"/>
+              <w:left w:val="single" w:sz="6" w:space="0" w:color="000000"/>
+              <w:bottom w:val="single" w:sz="6" w:space="0" w:color="000000"/>
+              <w:right w:val="single" w:sz="6" w:space="0" w:color="000000"/>
+            </w:tcBorders>
+            <w:vAlign w:val="center"/>
+            <w:hideMark/>
+          </w:tcPr>
+          <w:p>
+            <w:r>
+              <w:t>Overlaps right bound of region</w:t>
+            </w:r>
+          </w:p>
+        </w:tc>
+      </w:tr>
+      <w:tr>
+        <w:tc>
+          <w:tcPr>
+            <w:tcW w:w="1252" w:type="dxa"/>
+            <w:tcBorders>
+              <w:top w:val="single" w:sz="6" w:space="0" w:color="000000"/>
+              <w:left w:val="single" w:sz="6" w:space="0" w:color="000000"/>
+              <w:bottom w:val="single" w:sz="6" w:space="0" w:color="000000"/>
+              <w:right w:val="single" w:sz="6" w:space="0" w:color="000000"/>
+            </w:tcBorders>
+            <w:vAlign w:val="center"/>
+            <w:hideMark/>
+          </w:tcPr>
+          <w:p>
+            <w:r>
+              <w:t>Case 148</w:t>
+            </w:r>
+          </w:p>
+        </w:tc>
+        <w:tc>
+          <w:tcPr>
+            <w:tcW w:w="1440" w:type="dxa"/>
+            <w:tcBorders>
+              <w:top w:val="single" w:sz="6" w:space="0" w:color="000000"/>
+              <w:left w:val="single" w:sz="6" w:space="0" w:color="000000"/>
+              <w:bottom w:val="single" w:sz="6" w:space="0" w:color="000000"/>
+              <w:right w:val="single" w:sz="6" w:space="0" w:color="000000"/>
+            </w:tcBorders>
+            <w:vAlign w:val="center"/>
+            <w:hideMark/>
+          </w:tcPr>
+          <w:p>
+            <w:r>
+              <w:t>2011-03-24</w:t>
+            </w:r>
+          </w:p>
+        </w:tc>
+        <w:tc>
+          <w:tcPr>
+            <w:tcW w:w="2070" w:type="dxa"/>
+            <w:tcBorders>
+              <w:top w:val="single" w:sz="6" w:space="0" w:color="000000"/>
+              <w:left w:val="single" w:sz="6" w:space="0" w:color="000000"/>
+              <w:bottom w:val="single" w:sz="6" w:space="0" w:color="000000"/>
+              <w:right w:val="single" w:sz="6" w:space="0" w:color="000000"/>
+            </w:tcBorders>
+            <w:vAlign w:val="center"/>
+            <w:hideMark/>
+          </w:tcPr>
+          <w:p>
+            <w:r>
+              <w:t>Laptev Sea</w:t>
+            </w:r>
+          </w:p>
+        </w:tc>
+        <w:tc>
+          <w:tcPr>
+            <w:tcW w:w="4218" w:type="dxa"/>
+            <w:tcBorders>
+              <w:top w:val="single" w:sz="6" w:space="0" w:color="000000"/>
+              <w:left w:val="single" w:sz="6" w:space="0" w:color="000000"/>
+              <w:bottom w:val="single" w:sz="6" w:space="0" w:color="000000"/>
+              <w:right w:val="single" w:sz="6" w:space="0" w:color="000000"/>
+            </w:tcBorders>
+            <w:vAlign w:val="center"/>
+            <w:hideMark/>
+          </w:tcPr>
+          <w:p>
+            <w:r>
+              <w:t>Overlaps right bound of region</w:t>
+            </w:r>
+          </w:p>
+        </w:tc>
+      </w:tr>
+      <w:tr>
+        <w:trPr>
+          <w:trHeight w:val="450"/>
+        </w:trPr>
+        <w:tc>
+          <w:tcPr>
+            <w:tcW w:w="1252" w:type="dxa"/>
+            <w:tcBorders>
+              <w:top w:val="single" w:sz="6" w:space="0" w:color="000000"/>
+              <w:left w:val="single" w:sz="6" w:space="0" w:color="000000"/>
+              <w:bottom w:val="single" w:sz="6" w:space="0" w:color="000000"/>
+              <w:right w:val="single" w:sz="6" w:space="0" w:color="000000"/>
+            </w:tcBorders>
+            <w:vAlign w:val="center"/>
+            <w:hideMark/>
+          </w:tcPr>
+          <w:p>
+            <w:r>
+              <w:t>Case 151</w:t>
+            </w:r>
+          </w:p>
+        </w:tc>
+        <w:tc>
+          <w:tcPr>
+            <w:tcW w:w="1440" w:type="dxa"/>
+            <w:tcBorders>
+              <w:top w:val="single" w:sz="6" w:space="0" w:color="000000"/>
+              <w:left w:val="single" w:sz="6" w:space="0" w:color="000000"/>
+              <w:bottom w:val="single" w:sz="6" w:space="0" w:color="000000"/>
+              <w:right w:val="single" w:sz="6" w:space="0" w:color="000000"/>
+            </w:tcBorders>
+            <w:vAlign w:val="center"/>
+            <w:hideMark/>
+          </w:tcPr>
+          <w:p>
+            <w:r>
+              <w:t>2014-03-01</w:t>
+            </w:r>
+          </w:p>
+        </w:tc>
+        <w:tc>
+          <w:tcPr>
+            <w:tcW w:w="2070" w:type="dxa"/>
+            <w:tcBorders>
+              <w:top w:val="single" w:sz="6" w:space="0" w:color="000000"/>
+              <w:left w:val="single" w:sz="6" w:space="0" w:color="000000"/>
+              <w:bottom w:val="single" w:sz="6" w:space="0" w:color="000000"/>
+              <w:right w:val="single" w:sz="6" w:space="0" w:color="000000"/>
+            </w:tcBorders>
+            <w:vAlign w:val="center"/>
+            <w:hideMark/>
+          </w:tcPr>
+          <w:p>
+            <w:r>
+              <w:t>Laptev Sea</w:t>
+            </w:r>
+          </w:p>
+        </w:tc>
+        <w:tc>
+          <w:tcPr>
+            <w:tcW w:w="4218" w:type="dxa"/>
+            <w:tcBorders>
+              <w:top w:val="single" w:sz="6" w:space="0" w:color="000000"/>
+              <w:left w:val="single" w:sz="6" w:space="0" w:color="000000"/>
+              <w:bottom w:val="single" w:sz="6" w:space="0" w:color="000000"/>
+              <w:right w:val="single" w:sz="6" w:space="0" w:color="000000"/>
+            </w:tcBorders>
+            <w:vAlign w:val="center"/>
+            <w:hideMark/>
+          </w:tcPr>
+          <w:p>
+            <w:r>
+              <w:t>Missing data from MODIS</w:t>
+            </w:r>
+          </w:p>
+        </w:tc>
+      </w:tr>
+      <w:tr>
+        <w:tc>
+          <w:tcPr>
+            <w:tcW w:w="1252" w:type="dxa"/>
+            <w:tcBorders>
+              <w:top w:val="single" w:sz="6" w:space="0" w:color="000000"/>
+              <w:left w:val="single" w:sz="6" w:space="0" w:color="000000"/>
+              <w:bottom w:val="single" w:sz="6" w:space="0" w:color="000000"/>
+              <w:right w:val="single" w:sz="6" w:space="0" w:color="000000"/>
+            </w:tcBorders>
+            <w:vAlign w:val="center"/>
+            <w:hideMark/>
+          </w:tcPr>
+          <w:p>
+            <w:r>
+              <w:t>Case 168</w:t>
+            </w:r>
+          </w:p>
+        </w:tc>
+        <w:tc>
+          <w:tcPr>
+            <w:tcW w:w="1440" w:type="dxa"/>
+            <w:tcBorders>
+              <w:top w:val="single" w:sz="6" w:space="0" w:color="000000"/>
+              <w:left w:val="single" w:sz="6" w:space="0" w:color="000000"/>
+              <w:bottom w:val="single" w:sz="6" w:space="0" w:color="000000"/>
+              <w:right w:val="single" w:sz="6" w:space="0" w:color="000000"/>
+            </w:tcBorders>
+            <w:vAlign w:val="center"/>
+            <w:hideMark/>
+          </w:tcPr>
+          <w:p>
+            <w:r>
+              <w:t>2021-08-07</w:t>
+            </w:r>
+          </w:p>
+        </w:tc>
+        <w:tc>
+          <w:tcPr>
+            <w:tcW w:w="2070" w:type="dxa"/>
+            <w:tcBorders>
+              <w:top w:val="single" w:sz="6" w:space="0" w:color="000000"/>
+              <w:left w:val="single" w:sz="6" w:space="0" w:color="000000"/>
+              <w:bottom w:val="single" w:sz="6" w:space="0" w:color="000000"/>
+              <w:right w:val="single" w:sz="6" w:space="0" w:color="000000"/>
+            </w:tcBorders>
+            <w:vAlign w:val="center"/>
+            <w:hideMark/>
+          </w:tcPr>
+          <w:p>
+            <w:r>
+              <w:t>Laptev Sea</w:t>
+            </w:r>
+          </w:p>
+        </w:tc>
+        <w:tc>
+          <w:tcPr>
+            <w:tcW w:w="4218" w:type="dxa"/>
+            <w:tcBorders>
+              <w:top w:val="single" w:sz="6" w:space="0" w:color="000000"/>
+              <w:left w:val="single" w:sz="6" w:space="0" w:color="000000"/>
+              <w:bottom w:val="single" w:sz="6" w:space="0" w:color="000000"/>
+              <w:right w:val="single" w:sz="6" w:space="0" w:color="000000"/>
+            </w:tcBorders>
+            <w:vAlign w:val="center"/>
+            <w:hideMark/>
+          </w:tcPr>
+          <w:p>
+            <w:r>
+              <w:t>Overlaps left bound of region</w:t>
+            </w:r>
+          </w:p>
+        </w:tc>
+      </w:tr>
+      <w:tr>
+        <w:tc>
+          <w:tcPr>
+            <w:tcW w:w="1252" w:type="dxa"/>
+            <w:tcBorders>
+              <w:top w:val="single" w:sz="6" w:space="0" w:color="000000"/>
+              <w:left w:val="single" w:sz="6" w:space="0" w:color="000000"/>
+              <w:bottom w:val="single" w:sz="6" w:space="0" w:color="000000"/>
+              <w:right w:val="single" w:sz="6" w:space="0" w:color="000000"/>
+            </w:tcBorders>
+            <w:vAlign w:val="center"/>
+            <w:hideMark/>
+          </w:tcPr>
+          <w:p>
+            <w:r>
+              <w:t>Case 171</w:t>
+            </w:r>
+          </w:p>
+        </w:tc>
+        <w:tc>
+          <w:tcPr>
+            <w:tcW w:w="1440" w:type="dxa"/>
+            <w:tcBorders>
+              <w:top w:val="single" w:sz="6" w:space="0" w:color="000000"/>
+              <w:left w:val="single" w:sz="6" w:space="0" w:color="000000"/>
+              <w:bottom w:val="single" w:sz="6" w:space="0" w:color="000000"/>
+              <w:right w:val="single" w:sz="6" w:space="0" w:color="000000"/>
+            </w:tcBorders>
+            <w:vAlign w:val="center"/>
+            <w:hideMark/>
+          </w:tcPr>
+          <w:p>
+            <w:r>
+              <w:t>2009-06-18</w:t>
+            </w:r>
+          </w:p>
+        </w:tc>
+        <w:tc>
+          <w:tcPr>
+            <w:tcW w:w="2070" w:type="dxa"/>
+            <w:tcBorders>
+              <w:top w:val="single" w:sz="6" w:space="0" w:color="000000"/>
+              <w:left w:val="single" w:sz="6" w:space="0" w:color="000000"/>
+              <w:bottom w:val="single" w:sz="6" w:space="0" w:color="000000"/>
+              <w:right w:val="single" w:sz="6" w:space="0" w:color="000000"/>
+            </w:tcBorders>
+            <w:vAlign w:val="center"/>
+            <w:hideMark/>
+          </w:tcPr>
+          <w:p>
+            <w:r>
+              <w:t>Sea of Okhostk</w:t>
+            </w:r>
+          </w:p>
+        </w:tc>
+        <w:tc>
+          <w:tcPr>
+            <w:tcW w:w="4218" w:type="dxa"/>
+            <w:tcBorders>
+              <w:top w:val="single" w:sz="6" w:space="0" w:color="000000"/>
+              <w:left w:val="single" w:sz="6" w:space="0" w:color="000000"/>
+              <w:bottom w:val="single" w:sz="6" w:space="0" w:color="000000"/>
+              <w:right w:val="single" w:sz="6" w:space="0" w:color="000000"/>
+            </w:tcBorders>
+            <w:vAlign w:val="center"/>
+            <w:hideMark/>
+          </w:tcPr>
+          <w:p>
+            <w:r>
+              <w:t>Beyond region cutoff day of year</w:t>
+            </w:r>
+          </w:p>
+        </w:tc>
+      </w:tr>
+      <w:tr>
+        <w:tc>
+          <w:tcPr>
+            <w:tcW w:w="1252" w:type="dxa"/>
+            <w:tcBorders>
+              <w:top w:val="single" w:sz="6" w:space="0" w:color="000000"/>
+              <w:left w:val="single" w:sz="6" w:space="0" w:color="000000"/>
+              <w:bottom w:val="single" w:sz="6" w:space="0" w:color="000000"/>
+              <w:right w:val="single" w:sz="6" w:space="0" w:color="000000"/>
+            </w:tcBorders>
+            <w:vAlign w:val="center"/>
+            <w:hideMark/>
+          </w:tcPr>
+          <w:p>
+            <w:r>
+              <w:t>Case 173</w:t>
+            </w:r>
+          </w:p>
+        </w:tc>
+        <w:tc>
+          <w:tcPr>
+            <w:tcW w:w="1440" w:type="dxa"/>
+            <w:tcBorders>
+              <w:top w:val="single" w:sz="6" w:space="0" w:color="000000"/>
+              <w:left w:val="single" w:sz="6" w:space="0" w:color="000000"/>
+              <w:bottom w:val="single" w:sz="6" w:space="0" w:color="000000"/>
+              <w:right w:val="single" w:sz="6" w:space="0" w:color="000000"/>
+            </w:tcBorders>
+            <w:vAlign w:val="center"/>
+            <w:hideMark/>
+          </w:tcPr>
+          <w:p>
+            <w:r>
+              <w:t>2013-06-14</w:t>
+            </w:r>
+          </w:p>
+        </w:tc>
+        <w:tc>
+          <w:tcPr>
+            <w:tcW w:w="2070" w:type="dxa"/>
+            <w:tcBorders>
+              <w:top w:val="single" w:sz="6" w:space="0" w:color="000000"/>
+              <w:left w:val="single" w:sz="6" w:space="0" w:color="000000"/>
+              <w:bottom w:val="single" w:sz="6" w:space="0" w:color="000000"/>
+              <w:right w:val="single" w:sz="6" w:space="0" w:color="000000"/>
+            </w:tcBorders>
+            <w:vAlign w:val="center"/>
+            <w:hideMark/>
+          </w:tcPr>
+          <w:p>
+            <w:r>
+              <w:t>Sea of Okhostk</w:t>
+            </w:r>
+          </w:p>
+        </w:tc>
+        <w:tc>
+          <w:tcPr>
+            <w:tcW w:w="4218" w:type="dxa"/>
+            <w:tcBorders>
+              <w:top w:val="single" w:sz="6" w:space="0" w:color="000000"/>
+              <w:left w:val="single" w:sz="6" w:space="0" w:color="000000"/>
+              <w:bottom w:val="single" w:sz="6" w:space="0" w:color="000000"/>
+              <w:right w:val="single" w:sz="6" w:space="0" w:color="000000"/>
+            </w:tcBorders>
+            <w:vAlign w:val="center"/>
+            <w:hideMark/>
+          </w:tcPr>
+          <w:p>
+            <w:r>
+              <w:t>Beyond region cutoff day of year</w:t>
+            </w:r>
+          </w:p>
+        </w:tc>
+      </w:tr>
+    </w:tbl>
+    <w:p/>
+    <w:p>
+      <w:r>
+        <w:lastRenderedPageBreak/>
+        <w:br/>
       </w:r>
     </w:p>
     <w:p>

</xml_diff>

<commit_message>
working through replacement cases
</commit_message>
<xml_diff>
--- a/docs/version_history.docx
+++ b/docs/version_history.docx
@@ -210,19 +210,7 @@
               <w:rPr>
                 <w:rFonts w:ascii="Cambria Math" w:hAnsi="Cambria Math"/>
               </w:rPr>
-              <m:t>Y</m:t>
-            </m:r>
-            <m:r>
-              <w:rPr>
-                <w:rFonts w:ascii="Cambria Math" w:hAnsi="Cambria Math"/>
-              </w:rPr>
-              <m:t>∩</m:t>
-            </m:r>
-            <m:r>
-              <w:rPr>
-                <w:rFonts w:ascii="Cambria Math" w:hAnsi="Cambria Math"/>
-              </w:rPr>
-              <m:t>X</m:t>
+              <m:t>Y∩X</m:t>
             </m:r>
           </m:sub>
         </m:sSub>
@@ -438,13 +426,7 @@
                   <w:rPr>
                     <w:rFonts w:ascii="Cambria Math" w:eastAsiaTheme="minorEastAsia" w:hAnsi="Cambria Math"/>
                   </w:rPr>
-                  <m:t>Y</m:t>
-                </m:r>
-                <m:r>
-                  <w:rPr>
-                    <w:rFonts w:ascii="Cambria Math" w:eastAsiaTheme="minorEastAsia" w:hAnsi="Cambria Math"/>
-                  </w:rPr>
-                  <m:t xml:space="preserve">∩X </m:t>
+                  <m:t xml:space="preserve">Y∩X </m:t>
                 </m:r>
               </m:sub>
             </m:sSub>
@@ -509,10 +491,7 @@
       </w:r>
       <w:r>
         <w:br/>
-        <w:t xml:space="preserve">In Spring 2025, we identified an issue with late-summer samples: </w:t>
-      </w:r>
-      <w:r>
-        <w:t>erroneous high sea ice concentration in coastal waters in the NSIDC sea ice concentration dataset (Meier et al. 2021).</w:t>
+        <w:t>In Spring 2025, we identified an issue with late-summer samples: erroneous high sea ice concentration in coastal waters in the NSIDC sea ice concentration dataset (Meier et al. 2021).</w:t>
       </w:r>
       <w:r>
         <w:t xml:space="preserve"> </w:t>
@@ -551,6 +530,9 @@
         <w:jc w:val="center"/>
       </w:pPr>
       <w:r>
+        <w:rPr>
+          <w:noProof/>
+        </w:rPr>
         <w:drawing>
           <wp:inline distT="0" distB="0" distL="0" distR="0" wp14:anchorId="7F1BC1FD" wp14:editId="2412CE9E">
             <wp:extent cx="4338049" cy="5772942"/>
@@ -1576,6 +1558,9 @@
       </w:r>
     </w:p>
     <w:p>
+      <w:pPr>
+        <w:spacing w:line="240" w:lineRule="auto"/>
+      </w:pPr>
       <w:r>
         <w:t>Hatcher, S. (2024) “Error quantification in the Ice Floe Tracker algorithm.” Honors Batchelor’s Thesis, School of Engineering, Brown University</w:t>
       </w:r>
@@ -2453,6 +2438,7 @@
   <w:style w:type="character" w:default="1" w:styleId="DefaultParagraphFont">
     <w:name w:val="Default Paragraph Font"/>
     <w:uiPriority w:val="1"/>
+    <w:semiHidden/>
     <w:unhideWhenUsed/>
   </w:style>
   <w:style w:type="table" w:default="1" w:styleId="TableNormal">

</xml_diff>